<commit_message>
Refine IJLES article template header
</commit_message>
<xml_diff>
--- a/assets/templates/ijles-manuscript-template.docx
+++ b/assets/templates/ijles-manuscript-template.docx
@@ -2,6 +2,22 @@
 <file path=word/document.xml><?xml version="1.0" encoding="utf-8"?>
 <w:document xmlns:wpc="http://schemas.microsoft.com/office/word/2010/wordprocessingCanvas" xmlns:mo="http://schemas.microsoft.com/office/mac/office/2008/main" xmlns:mc="http://schemas.openxmlformats.org/markup-compatibility/2006" xmlns:mv="urn:schemas-microsoft-com:mac:vml" xmlns:o="urn:schemas-microsoft-com:office:office" xmlns:r="http://schemas.openxmlformats.org/officeDocument/2006/relationships" xmlns:m="http://schemas.openxmlformats.org/officeDocument/2006/math" xmlns:v="urn:schemas-microsoft-com:vml" xmlns:wp14="http://schemas.microsoft.com/office/word/2010/wordprocessingDrawing" xmlns:wp="http://schemas.openxmlformats.org/drawingml/2006/wordprocessingDrawing" xmlns:w10="urn:schemas-microsoft-com:office:word" xmlns:w="http://schemas.openxmlformats.org/wordprocessingml/2006/main" xmlns:w14="http://schemas.microsoft.com/office/word/2010/wordml" xmlns:wpg="http://schemas.microsoft.com/office/word/2010/wordprocessingGroup" xmlns:wpi="http://schemas.microsoft.com/office/word/2010/wordprocessingInk" xmlns:wne="http://schemas.microsoft.com/office/word/2006/wordml" xmlns:wps="http://schemas.microsoft.com/office/word/2010/wordprocessingShape" mc:Ignorable="w14 wp14">
   <w:body>
+    <w:p>
+      <w:pPr>
+        <w:spacing w:before="0" w:after="80" w:line="252" w:lineRule="auto"/>
+        <w:jc w:val="center"/>
+      </w:pPr>
+      <w:r>
+        <w:rPr>
+          <w:rFonts w:ascii="Times New Roman" w:hAnsi="Times New Roman"/>
+          <w:b/>
+          <w:i w:val="0"/>
+          <w:color w:val="0B2D45"/>
+          <w:sz w:val="30"/>
+        </w:rPr>
+        <w:t>[Article Title]</w:t>
+      </w:r>
+    </w:p>
     <w:p>
       <w:pPr>
         <w:spacing w:before="0" w:after="40" w:line="252" w:lineRule="auto"/>
@@ -12,31 +28,16 @@
           <w:rFonts w:ascii="Times New Roman" w:hAnsi="Times New Roman"/>
           <w:b/>
           <w:i w:val="0"/>
-          <w:color w:val="0B2D45"/>
-          <w:sz w:val="36"/>
+          <w:color w:val="236D73"/>
+          <w:sz w:val="21"/>
         </w:rPr>
-        <w:t>IJLES Manuscript Template</w:t>
+        <w:t>[Author Name(s)]</w:t>
       </w:r>
     </w:p>
     <w:p>
       <w:pPr>
-        <w:spacing w:before="0" w:after="280" w:line="252" w:lineRule="auto"/>
+        <w:spacing w:before="0" w:after="180" w:line="252" w:lineRule="auto"/>
         <w:jc w:val="center"/>
-      </w:pPr>
-      <w:r>
-        <w:rPr>
-          <w:rFonts w:ascii="Times New Roman" w:hAnsi="Times New Roman"/>
-          <w:b/>
-          <w:i w:val="0"/>
-          <w:color w:val="236D73"/>
-          <w:sz w:val="22"/>
-        </w:rPr>
-        <w:t>International Journal of Language, Education and Society</w:t>
-      </w:r>
-    </w:p>
-    <w:p>
-      <w:pPr>
-        <w:spacing w:before="0" w:after="160" w:line="264" w:lineRule="auto"/>
       </w:pPr>
       <w:r>
         <w:rPr>
@@ -44,544 +45,9 @@
           <w:b w:val="0"/>
           <w:i/>
           <w:color w:val="586674"/>
-          <w:sz w:val="20"/>
+          <w:sz w:val="17"/>
         </w:rPr>
-        <w:t>Use this template for manuscripts submitted to IJLES. Submit a blinded manuscript and a separate title page when requested by the journal.</w:t>
-      </w:r>
-    </w:p>
-    <w:p>
-      <w:pPr>
-        <w:spacing w:before="280" w:after="120"/>
-      </w:pPr>
-      <w:r>
-        <w:rPr>
-          <w:rFonts w:ascii="Times New Roman" w:hAnsi="Times New Roman"/>
-          <w:b/>
-          <w:color w:val="0B2D45"/>
-          <w:sz w:val="28"/>
-        </w:rPr>
-        <w:t>Title Page Information</w:t>
-      </w:r>
-    </w:p>
-    <w:p>
-      <w:pPr>
-        <w:spacing w:before="0" w:after="160" w:line="264" w:lineRule="auto"/>
-      </w:pPr>
-      <w:r>
-        <w:rPr>
-          <w:rFonts w:ascii="Times New Roman" w:hAnsi="Times New Roman"/>
-          <w:b w:val="0"/>
-          <w:i/>
-          <w:color w:val="586674"/>
-          <w:sz w:val="20"/>
-        </w:rPr>
-        <w:t>This information should be placed on a separate title page file if the manuscript is prepared for anonymous review.</w:t>
-      </w:r>
-    </w:p>
-    <w:p>
-      <w:pPr>
-        <w:spacing w:after="160"/>
-      </w:pPr>
-      <w:r>
-        <w:rPr>
-          <w:rFonts w:ascii="Times New Roman" w:hAnsi="Times New Roman"/>
-          <w:b/>
-          <w:color w:val="0B2D45"/>
-          <w:sz w:val="22"/>
-        </w:rPr>
-        <w:t xml:space="preserve">Manuscript title: </w:t>
-      </w:r>
-      <w:r>
-        <w:rPr>
-          <w:rFonts w:ascii="Times New Roman" w:hAnsi="Times New Roman"/>
-          <w:i/>
-          <w:color w:val="586674"/>
-          <w:sz w:val="22"/>
-        </w:rPr>
-        <w:t>[Insert information here]</w:t>
-      </w:r>
-    </w:p>
-    <w:p>
-      <w:pPr>
-        <w:spacing w:after="160"/>
-      </w:pPr>
-      <w:r>
-        <w:rPr>
-          <w:rFonts w:ascii="Times New Roman" w:hAnsi="Times New Roman"/>
-          <w:b/>
-          <w:color w:val="0B2D45"/>
-          <w:sz w:val="22"/>
-        </w:rPr>
-        <w:t xml:space="preserve">Author name(s): </w:t>
-      </w:r>
-      <w:r>
-        <w:rPr>
-          <w:rFonts w:ascii="Times New Roman" w:hAnsi="Times New Roman"/>
-          <w:i/>
-          <w:color w:val="586674"/>
-          <w:sz w:val="22"/>
-        </w:rPr>
-        <w:t>[Insert information here]</w:t>
-      </w:r>
-    </w:p>
-    <w:p>
-      <w:pPr>
-        <w:spacing w:after="160"/>
-      </w:pPr>
-      <w:r>
-        <w:rPr>
-          <w:rFonts w:ascii="Times New Roman" w:hAnsi="Times New Roman"/>
-          <w:b/>
-          <w:color w:val="0B2D45"/>
-          <w:sz w:val="22"/>
-        </w:rPr>
-        <w:t xml:space="preserve">Affiliation(s): </w:t>
-      </w:r>
-      <w:r>
-        <w:rPr>
-          <w:rFonts w:ascii="Times New Roman" w:hAnsi="Times New Roman"/>
-          <w:i/>
-          <w:color w:val="586674"/>
-          <w:sz w:val="22"/>
-        </w:rPr>
-        <w:t>[Insert information here]</w:t>
-      </w:r>
-    </w:p>
-    <w:p>
-      <w:pPr>
-        <w:spacing w:after="160"/>
-      </w:pPr>
-      <w:r>
-        <w:rPr>
-          <w:rFonts w:ascii="Times New Roman" w:hAnsi="Times New Roman"/>
-          <w:b/>
-          <w:color w:val="0B2D45"/>
-          <w:sz w:val="22"/>
-        </w:rPr>
-        <w:t xml:space="preserve">ORCID iD(s): </w:t>
-      </w:r>
-      <w:r>
-        <w:rPr>
-          <w:rFonts w:ascii="Times New Roman" w:hAnsi="Times New Roman"/>
-          <w:i/>
-          <w:color w:val="586674"/>
-          <w:sz w:val="22"/>
-        </w:rPr>
-        <w:t>[Insert information here]</w:t>
-      </w:r>
-    </w:p>
-    <w:p>
-      <w:pPr>
-        <w:spacing w:after="160"/>
-      </w:pPr>
-      <w:r>
-        <w:rPr>
-          <w:rFonts w:ascii="Times New Roman" w:hAnsi="Times New Roman"/>
-          <w:b/>
-          <w:color w:val="0B2D45"/>
-          <w:sz w:val="22"/>
-        </w:rPr>
-        <w:t xml:space="preserve">Corresponding author email: </w:t>
-      </w:r>
-      <w:r>
-        <w:rPr>
-          <w:rFonts w:ascii="Times New Roman" w:hAnsi="Times New Roman"/>
-          <w:i/>
-          <w:color w:val="586674"/>
-          <w:sz w:val="22"/>
-        </w:rPr>
-        <w:t>[Insert information here]</w:t>
-      </w:r>
-    </w:p>
-    <w:p>
-      <w:pPr>
-        <w:spacing w:after="160"/>
-      </w:pPr>
-      <w:r>
-        <w:rPr>
-          <w:rFonts w:ascii="Times New Roman" w:hAnsi="Times New Roman"/>
-          <w:b/>
-          <w:color w:val="0B2D45"/>
-          <w:sz w:val="22"/>
-        </w:rPr>
-        <w:t xml:space="preserve">Funding statement: </w:t>
-      </w:r>
-      <w:r>
-        <w:rPr>
-          <w:rFonts w:ascii="Times New Roman" w:hAnsi="Times New Roman"/>
-          <w:i/>
-          <w:color w:val="586674"/>
-          <w:sz w:val="22"/>
-        </w:rPr>
-        <w:t>[Insert information here]</w:t>
-      </w:r>
-    </w:p>
-    <w:p>
-      <w:pPr>
-        <w:spacing w:after="160"/>
-      </w:pPr>
-      <w:r>
-        <w:rPr>
-          <w:rFonts w:ascii="Times New Roman" w:hAnsi="Times New Roman"/>
-          <w:b/>
-          <w:color w:val="0B2D45"/>
-          <w:sz w:val="22"/>
-        </w:rPr>
-        <w:t xml:space="preserve">Conflict of interest statement: </w:t>
-      </w:r>
-      <w:r>
-        <w:rPr>
-          <w:rFonts w:ascii="Times New Roman" w:hAnsi="Times New Roman"/>
-          <w:i/>
-          <w:color w:val="586674"/>
-          <w:sz w:val="22"/>
-        </w:rPr>
-        <w:t>[Insert information here]</w:t>
-      </w:r>
-    </w:p>
-    <w:p>
-      <w:pPr>
-        <w:spacing w:after="160"/>
-      </w:pPr>
-      <w:r>
-        <w:rPr>
-          <w:rFonts w:ascii="Times New Roman" w:hAnsi="Times New Roman"/>
-          <w:b/>
-          <w:color w:val="0B2D45"/>
-          <w:sz w:val="22"/>
-        </w:rPr>
-        <w:t xml:space="preserve">Ethics approval / informed consent statement: </w:t>
-      </w:r>
-      <w:r>
-        <w:rPr>
-          <w:rFonts w:ascii="Times New Roman" w:hAnsi="Times New Roman"/>
-          <w:i/>
-          <w:color w:val="586674"/>
-          <w:sz w:val="22"/>
-        </w:rPr>
-        <w:t>[Insert information here]</w:t>
-      </w:r>
-    </w:p>
-    <w:p>
-      <w:pPr>
-        <w:spacing w:after="160"/>
-      </w:pPr>
-      <w:r>
-        <w:rPr>
-          <w:rFonts w:ascii="Times New Roman" w:hAnsi="Times New Roman"/>
-          <w:b/>
-          <w:color w:val="0B2D45"/>
-          <w:sz w:val="22"/>
-        </w:rPr>
-        <w:t xml:space="preserve">AI use disclosure, if applicable: </w:t>
-      </w:r>
-      <w:r>
-        <w:rPr>
-          <w:rFonts w:ascii="Times New Roman" w:hAnsi="Times New Roman"/>
-          <w:i/>
-          <w:color w:val="586674"/>
-          <w:sz w:val="22"/>
-        </w:rPr>
-        <w:t>[Insert information here]</w:t>
-      </w:r>
-    </w:p>
-    <w:p>
-      <w:pPr>
-        <w:spacing w:before="280" w:after="120"/>
-      </w:pPr>
-      <w:r>
-        <w:rPr>
-          <w:rFonts w:ascii="Times New Roman" w:hAnsi="Times New Roman"/>
-          <w:b/>
-          <w:color w:val="0B2D45"/>
-          <w:sz w:val="28"/>
-        </w:rPr>
-        <w:t>Blinded Manuscript</w:t>
-      </w:r>
-    </w:p>
-    <w:p>
-      <w:pPr>
-        <w:spacing w:before="0" w:after="200" w:line="276" w:lineRule="auto"/>
-        <w:jc w:val="center"/>
-      </w:pPr>
-      <w:r>
-        <w:rPr>
-          <w:rFonts w:ascii="Times New Roman" w:hAnsi="Times New Roman"/>
-          <w:b/>
-          <w:i w:val="0"/>
-          <w:color w:val="0B2D45"/>
-          <w:sz w:val="32"/>
-        </w:rPr>
-        <w:t>[Insert manuscript title here]</w:t>
-      </w:r>
-    </w:p>
-    <w:p>
-      <w:pPr>
-        <w:spacing w:before="280" w:after="120"/>
-      </w:pPr>
-      <w:r>
-        <w:rPr>
-          <w:rFonts w:ascii="Times New Roman" w:hAnsi="Times New Roman"/>
-          <w:b/>
-          <w:color w:val="0B2D45"/>
-          <w:sz w:val="28"/>
-        </w:rPr>
-        <w:t>Abstract</w:t>
-      </w:r>
-    </w:p>
-    <w:p>
-      <w:pPr>
-        <w:spacing w:before="0" w:after="160" w:line="264" w:lineRule="auto"/>
-      </w:pPr>
-      <w:r>
-        <w:rPr>
-          <w:rFonts w:ascii="Times New Roman" w:hAnsi="Times New Roman"/>
-          <w:b w:val="0"/>
-          <w:i/>
-          <w:color w:val="586674"/>
-          <w:sz w:val="20"/>
-        </w:rPr>
-        <w:t>Write a concise abstract. Recommended length: 150-250 words unless a specific call for papers states otherwise.</w:t>
-      </w:r>
-    </w:p>
-    <w:p>
-      <w:pPr>
-        <w:spacing w:before="0" w:after="120" w:line="276" w:lineRule="auto"/>
-      </w:pPr>
-      <w:r>
-        <w:rPr>
-          <w:rFonts w:ascii="Times New Roman" w:hAnsi="Times New Roman"/>
-          <w:b w:val="0"/>
-          <w:i w:val="0"/>
-          <w:sz w:val="24"/>
-        </w:rPr>
-        <w:t>[Insert abstract text here. The abstract should summarize the purpose, method, key findings, and contribution of the study.]</w:t>
-      </w:r>
-    </w:p>
-    <w:p>
-      <w:pPr>
-        <w:spacing w:before="280" w:after="120"/>
-      </w:pPr>
-      <w:r>
-        <w:rPr>
-          <w:rFonts w:ascii="Times New Roman" w:hAnsi="Times New Roman"/>
-          <w:b/>
-          <w:color w:val="0B2D45"/>
-          <w:sz w:val="28"/>
-        </w:rPr>
-        <w:t>Keywords</w:t>
-      </w:r>
-    </w:p>
-    <w:p>
-      <w:pPr>
-        <w:spacing w:before="0" w:after="120" w:line="276" w:lineRule="auto"/>
-      </w:pPr>
-      <w:r>
-        <w:rPr>
-          <w:rFonts w:ascii="Times New Roman" w:hAnsi="Times New Roman"/>
-          <w:b w:val="0"/>
-          <w:i/>
-          <w:color w:val="586674"/>
-          <w:sz w:val="24"/>
-        </w:rPr>
-        <w:t>[keyword 1]; [keyword 2]; [keyword 3]; [keyword 4]; [keyword 5]</w:t>
-      </w:r>
-    </w:p>
-    <w:p>
-      <w:pPr>
-        <w:spacing w:before="280" w:after="120"/>
-      </w:pPr>
-      <w:r>
-        <w:rPr>
-          <w:rFonts w:ascii="Times New Roman" w:hAnsi="Times New Roman"/>
-          <w:b/>
-          <w:color w:val="0B2D45"/>
-          <w:sz w:val="28"/>
-        </w:rPr>
-        <w:t>1. Introduction</w:t>
-      </w:r>
-    </w:p>
-    <w:p>
-      <w:pPr>
-        <w:spacing w:before="0" w:after="120" w:line="360" w:lineRule="auto"/>
-      </w:pPr>
-      <w:r>
-        <w:rPr>
-          <w:rFonts w:ascii="Times New Roman" w:hAnsi="Times New Roman"/>
-          <w:b w:val="0"/>
-          <w:i w:val="0"/>
-          <w:sz w:val="24"/>
-        </w:rPr>
-        <w:t>[Introduce the problem, scholarly context, research gap, and aim of the study.]</w:t>
-      </w:r>
-    </w:p>
-    <w:p>
-      <w:pPr>
-        <w:spacing w:before="280" w:after="120"/>
-      </w:pPr>
-      <w:r>
-        <w:rPr>
-          <w:rFonts w:ascii="Times New Roman" w:hAnsi="Times New Roman"/>
-          <w:b/>
-          <w:color w:val="0B2D45"/>
-          <w:sz w:val="28"/>
-        </w:rPr>
-        <w:t>2. Literature Review / Theoretical Framework</w:t>
-      </w:r>
-    </w:p>
-    <w:p>
-      <w:pPr>
-        <w:spacing w:before="0" w:after="120" w:line="360" w:lineRule="auto"/>
-      </w:pPr>
-      <w:r>
-        <w:rPr>
-          <w:rFonts w:ascii="Times New Roman" w:hAnsi="Times New Roman"/>
-          <w:b w:val="0"/>
-          <w:i w:val="0"/>
-          <w:sz w:val="24"/>
-        </w:rPr>
-        <w:t>[Present the relevant literature and theoretical framework. Use APA 7 in-text citations.]</w:t>
-      </w:r>
-    </w:p>
-    <w:p>
-      <w:pPr>
-        <w:spacing w:before="280" w:after="120"/>
-      </w:pPr>
-      <w:r>
-        <w:rPr>
-          <w:rFonts w:ascii="Times New Roman" w:hAnsi="Times New Roman"/>
-          <w:b/>
-          <w:color w:val="0B2D45"/>
-          <w:sz w:val="28"/>
-        </w:rPr>
-        <w:t>3. Method</w:t>
-      </w:r>
-    </w:p>
-    <w:p>
-      <w:pPr>
-        <w:spacing w:before="0" w:after="120" w:line="360" w:lineRule="auto"/>
-      </w:pPr>
-      <w:r>
-        <w:rPr>
-          <w:rFonts w:ascii="Times New Roman" w:hAnsi="Times New Roman"/>
-          <w:b w:val="0"/>
-          <w:i w:val="0"/>
-          <w:sz w:val="24"/>
-        </w:rPr>
-        <w:t>[Describe research design, participants/context, data collection, data analysis, trustworthiness/validity, and ethical procedures.]</w:t>
-      </w:r>
-    </w:p>
-    <w:p>
-      <w:pPr>
-        <w:spacing w:before="280" w:after="120"/>
-      </w:pPr>
-      <w:r>
-        <w:rPr>
-          <w:rFonts w:ascii="Times New Roman" w:hAnsi="Times New Roman"/>
-          <w:b/>
-          <w:color w:val="0B2D45"/>
-          <w:sz w:val="28"/>
-        </w:rPr>
-        <w:t>4. Findings</w:t>
-      </w:r>
-    </w:p>
-    <w:p>
-      <w:pPr>
-        <w:spacing w:before="0" w:after="120" w:line="360" w:lineRule="auto"/>
-      </w:pPr>
-      <w:r>
-        <w:rPr>
-          <w:rFonts w:ascii="Times New Roman" w:hAnsi="Times New Roman"/>
-          <w:b w:val="0"/>
-          <w:i w:val="0"/>
-          <w:sz w:val="24"/>
-        </w:rPr>
-        <w:t>[Present findings clearly. Use tables and figures only when they add value.]</w:t>
-      </w:r>
-    </w:p>
-    <w:p>
-      <w:pPr>
-        <w:spacing w:before="280" w:after="120"/>
-      </w:pPr>
-      <w:r>
-        <w:rPr>
-          <w:rFonts w:ascii="Times New Roman" w:hAnsi="Times New Roman"/>
-          <w:b/>
-          <w:color w:val="0B2D45"/>
-          <w:sz w:val="28"/>
-        </w:rPr>
-        <w:t>5. Discussion</w:t>
-      </w:r>
-    </w:p>
-    <w:p>
-      <w:pPr>
-        <w:spacing w:before="0" w:after="120" w:line="360" w:lineRule="auto"/>
-      </w:pPr>
-      <w:r>
-        <w:rPr>
-          <w:rFonts w:ascii="Times New Roman" w:hAnsi="Times New Roman"/>
-          <w:b w:val="0"/>
-          <w:i w:val="0"/>
-          <w:sz w:val="24"/>
-        </w:rPr>
-        <w:t>[Interpret findings in relation to the literature, theory, and educational/social implications.]</w:t>
-      </w:r>
-    </w:p>
-    <w:p>
-      <w:pPr>
-        <w:spacing w:before="280" w:after="120"/>
-      </w:pPr>
-      <w:r>
-        <w:rPr>
-          <w:rFonts w:ascii="Times New Roman" w:hAnsi="Times New Roman"/>
-          <w:b/>
-          <w:color w:val="0B2D45"/>
-          <w:sz w:val="28"/>
-        </w:rPr>
-        <w:t>6. Conclusion</w:t>
-      </w:r>
-    </w:p>
-    <w:p>
-      <w:pPr>
-        <w:spacing w:before="0" w:after="120" w:line="360" w:lineRule="auto"/>
-      </w:pPr>
-      <w:r>
-        <w:rPr>
-          <w:rFonts w:ascii="Times New Roman" w:hAnsi="Times New Roman"/>
-          <w:b w:val="0"/>
-          <w:i w:val="0"/>
-          <w:sz w:val="24"/>
-        </w:rPr>
-        <w:t>[Summarize the contribution, limitations, and suggestions for future research.]</w:t>
-      </w:r>
-    </w:p>
-    <w:p>
-      <w:pPr>
-        <w:spacing w:before="280" w:after="120"/>
-      </w:pPr>
-      <w:r>
-        <w:rPr>
-          <w:rFonts w:ascii="Times New Roman" w:hAnsi="Times New Roman"/>
-          <w:b/>
-          <w:color w:val="0B2D45"/>
-          <w:sz w:val="28"/>
-        </w:rPr>
-        <w:t>Tables and Figures</w:t>
-      </w:r>
-    </w:p>
-    <w:p>
-      <w:pPr>
-        <w:spacing w:before="0" w:after="160" w:line="264" w:lineRule="auto"/>
-      </w:pPr>
-      <w:r>
-        <w:rPr>
-          <w:rFonts w:ascii="Times New Roman" w:hAnsi="Times New Roman"/>
-          <w:b w:val="0"/>
-          <w:i/>
-          <w:color w:val="586674"/>
-          <w:sz w:val="20"/>
-        </w:rPr>
-        <w:t>Use APA 7 table and figure numbering. Place each table/figure close to its first mention or at the end if required.</w:t>
+        <w:t>[Affiliation(s), Country] | [ORCID iD(s)] | [Corresponding author email]</w:t>
       </w:r>
     </w:p>
     <w:tbl>
@@ -592,86 +58,117 @@
         <w:tblLook w:firstColumn="1" w:firstRow="1" w:lastColumn="0" w:lastRow="0" w:noHBand="0" w:noVBand="1" w:val="04A0"/>
       </w:tblPr>
       <w:tblGrid>
-        <w:gridCol w:w="3120"/>
-        <w:gridCol w:w="3120"/>
-        <w:gridCol w:w="3120"/>
+        <w:gridCol w:w="2340"/>
+        <w:gridCol w:w="2340"/>
+        <w:gridCol w:w="2340"/>
+        <w:gridCol w:w="2340"/>
       </w:tblGrid>
       <w:tr>
         <w:tc>
           <w:tcPr>
-            <w:tcW w:type="dxa" w:w="2448"/>
-            <w:shd w:fill="F2F4F7"/>
+            <w:tcW w:type="dxa" w:w="2088"/>
             <w:tcBorders>
               <w:top w:val="single" w:sz="4" w:space="0" w:color="D9DEE5"/>
               <w:left w:val="single" w:sz="4" w:space="0" w:color="D9DEE5"/>
               <w:bottom w:val="single" w:sz="4" w:space="0" w:color="D9DEE5"/>
               <w:right w:val="single" w:sz="4" w:space="0" w:color="D9DEE5"/>
             </w:tcBorders>
+            <w:shd w:fill="F4F7F8"/>
+            <w:vAlign w:val="center"/>
           </w:tcPr>
           <w:p>
             <w:pPr>
-              <w:spacing w:after="0"/>
+              <w:spacing w:before="0" w:after="0" w:line="252" w:lineRule="auto"/>
             </w:pPr>
             <w:r>
               <w:rPr>
                 <w:rFonts w:ascii="Calibri" w:hAnsi="Calibri"/>
                 <w:b/>
                 <w:color w:val="0B2D45"/>
-                <w:sz w:val="19"/>
+                <w:sz w:val="16"/>
               </w:rPr>
-              <w:t>Component</w:t>
+              <w:t>Article Type</w:t>
             </w:r>
           </w:p>
         </w:tc>
         <w:tc>
           <w:tcPr>
-            <w:tcW w:type="dxa" w:w="3456"/>
-            <w:shd w:fill="F2F4F7"/>
+            <w:tcW w:type="dxa" w:w="2232"/>
             <w:tcBorders>
               <w:top w:val="single" w:sz="4" w:space="0" w:color="D9DEE5"/>
               <w:left w:val="single" w:sz="4" w:space="0" w:color="D9DEE5"/>
               <w:bottom w:val="single" w:sz="4" w:space="0" w:color="D9DEE5"/>
               <w:right w:val="single" w:sz="4" w:space="0" w:color="D9DEE5"/>
             </w:tcBorders>
+            <w:shd w:fill="F4F7F8"/>
+            <w:vAlign w:val="center"/>
           </w:tcPr>
           <w:p>
             <w:pPr>
-              <w:spacing w:after="0"/>
+              <w:spacing w:before="0" w:after="0" w:line="252" w:lineRule="auto"/>
             </w:pPr>
             <w:r>
               <w:rPr>
                 <w:rFonts w:ascii="Calibri" w:hAnsi="Calibri"/>
                 <w:b/>
                 <w:color w:val="0B2D45"/>
-                <w:sz w:val="19"/>
+                <w:sz w:val="16"/>
               </w:rPr>
-              <w:t>APA 7 expectation</w:t>
+              <w:t>Received</w:t>
             </w:r>
           </w:p>
         </w:tc>
         <w:tc>
           <w:tcPr>
-            <w:tcW w:type="dxa" w:w="3456"/>
-            <w:shd w:fill="F2F4F7"/>
+            <w:tcW w:type="dxa" w:w="2232"/>
             <w:tcBorders>
               <w:top w:val="single" w:sz="4" w:space="0" w:color="D9DEE5"/>
               <w:left w:val="single" w:sz="4" w:space="0" w:color="D9DEE5"/>
               <w:bottom w:val="single" w:sz="4" w:space="0" w:color="D9DEE5"/>
               <w:right w:val="single" w:sz="4" w:space="0" w:color="D9DEE5"/>
             </w:tcBorders>
+            <w:shd w:fill="F4F7F8"/>
+            <w:vAlign w:val="center"/>
           </w:tcPr>
           <w:p>
             <w:pPr>
-              <w:spacing w:after="0"/>
+              <w:spacing w:before="0" w:after="0" w:line="252" w:lineRule="auto"/>
             </w:pPr>
             <w:r>
               <w:rPr>
                 <w:rFonts w:ascii="Calibri" w:hAnsi="Calibri"/>
                 <w:b/>
                 <w:color w:val="0B2D45"/>
-                <w:sz w:val="19"/>
+                <w:sz w:val="16"/>
               </w:rPr>
-              <w:t>Author note</w:t>
+              <w:t>Accepted</w:t>
+            </w:r>
+          </w:p>
+        </w:tc>
+        <w:tc>
+          <w:tcPr>
+            <w:tcW w:type="dxa" w:w="2808"/>
+            <w:tcBorders>
+              <w:top w:val="single" w:sz="4" w:space="0" w:color="D9DEE5"/>
+              <w:left w:val="single" w:sz="4" w:space="0" w:color="D9DEE5"/>
+              <w:bottom w:val="single" w:sz="4" w:space="0" w:color="D9DEE5"/>
+              <w:right w:val="single" w:sz="4" w:space="0" w:color="D9DEE5"/>
+            </w:tcBorders>
+            <w:shd w:fill="F4F7F8"/>
+            <w:vAlign w:val="center"/>
+          </w:tcPr>
+          <w:p>
+            <w:pPr>
+              <w:spacing w:before="0" w:after="0" w:line="252" w:lineRule="auto"/>
+            </w:pPr>
+            <w:r>
+              <w:rPr>
+                <w:rFonts w:ascii="Calibri" w:hAnsi="Calibri"/>
+                <w:b/>
+                <w:color w:val="0B2D45"/>
+                <w:sz w:val="16"/>
+              </w:rPr>
+              <w:t>Published</w:t>
             </w:r>
           </w:p>
         </w:tc>
@@ -679,76 +176,105 @@
       <w:tr>
         <w:tc>
           <w:tcPr>
-            <w:tcW w:type="dxa" w:w="2448"/>
+            <w:tcW w:type="dxa" w:w="2088"/>
             <w:tcBorders>
               <w:top w:val="single" w:sz="4" w:space="0" w:color="D9DEE5"/>
               <w:left w:val="single" w:sz="4" w:space="0" w:color="D9DEE5"/>
               <w:bottom w:val="single" w:sz="4" w:space="0" w:color="D9DEE5"/>
               <w:right w:val="single" w:sz="4" w:space="0" w:color="D9DEE5"/>
             </w:tcBorders>
+            <w:vAlign w:val="center"/>
           </w:tcPr>
           <w:p>
             <w:pPr>
-              <w:spacing w:after="0"/>
+              <w:spacing w:before="0" w:after="0" w:line="252" w:lineRule="auto"/>
             </w:pPr>
             <w:r>
               <w:rPr>
                 <w:rFonts w:ascii="Calibri" w:hAnsi="Calibri"/>
                 <w:b/>
                 <w:color w:val="0B2D45"/>
-                <w:sz w:val="19"/>
+                <w:sz w:val="16"/>
               </w:rPr>
-              <w:t>Table title</w:t>
+              <w:t>[Research Article]</w:t>
             </w:r>
           </w:p>
         </w:tc>
         <w:tc>
           <w:tcPr>
-            <w:tcW w:type="dxa" w:w="3456"/>
+            <w:tcW w:type="dxa" w:w="2232"/>
             <w:tcBorders>
               <w:top w:val="single" w:sz="4" w:space="0" w:color="D9DEE5"/>
               <w:left w:val="single" w:sz="4" w:space="0" w:color="D9DEE5"/>
               <w:bottom w:val="single" w:sz="4" w:space="0" w:color="D9DEE5"/>
               <w:right w:val="single" w:sz="4" w:space="0" w:color="D9DEE5"/>
             </w:tcBorders>
+            <w:vAlign w:val="center"/>
           </w:tcPr>
           <w:p>
             <w:pPr>
-              <w:spacing w:after="0"/>
+              <w:spacing w:before="0" w:after="0" w:line="252" w:lineRule="auto"/>
             </w:pPr>
             <w:r>
               <w:rPr>
                 <w:rFonts w:ascii="Calibri" w:hAnsi="Calibri"/>
                 <w:b w:val="0"/>
                 <w:color w:val="586674"/>
-                <w:sz w:val="19"/>
+                <w:sz w:val="16"/>
               </w:rPr>
-              <w:t>Above the table, concise and italicized where appropriate.</w:t>
+              <w:t>[Date]</w:t>
             </w:r>
           </w:p>
         </w:tc>
         <w:tc>
           <w:tcPr>
-            <w:tcW w:type="dxa" w:w="3456"/>
+            <w:tcW w:type="dxa" w:w="2232"/>
             <w:tcBorders>
               <w:top w:val="single" w:sz="4" w:space="0" w:color="D9DEE5"/>
               <w:left w:val="single" w:sz="4" w:space="0" w:color="D9DEE5"/>
               <w:bottom w:val="single" w:sz="4" w:space="0" w:color="D9DEE5"/>
               <w:right w:val="single" w:sz="4" w:space="0" w:color="D9DEE5"/>
             </w:tcBorders>
+            <w:vAlign w:val="center"/>
           </w:tcPr>
           <w:p>
             <w:pPr>
-              <w:spacing w:after="0"/>
+              <w:spacing w:before="0" w:after="0" w:line="252" w:lineRule="auto"/>
             </w:pPr>
             <w:r>
               <w:rPr>
                 <w:rFonts w:ascii="Calibri" w:hAnsi="Calibri"/>
                 <w:b w:val="0"/>
                 <w:color w:val="586674"/>
-                <w:sz w:val="19"/>
+                <w:sz w:val="16"/>
               </w:rPr>
-              <w:t>[Insert note]</w:t>
+              <w:t>[Date]</w:t>
+            </w:r>
+          </w:p>
+        </w:tc>
+        <w:tc>
+          <w:tcPr>
+            <w:tcW w:type="dxa" w:w="2808"/>
+            <w:tcBorders>
+              <w:top w:val="single" w:sz="4" w:space="0" w:color="D9DEE5"/>
+              <w:left w:val="single" w:sz="4" w:space="0" w:color="D9DEE5"/>
+              <w:bottom w:val="single" w:sz="4" w:space="0" w:color="D9DEE5"/>
+              <w:right w:val="single" w:sz="4" w:space="0" w:color="D9DEE5"/>
+            </w:tcBorders>
+            <w:vAlign w:val="center"/>
+          </w:tcPr>
+          <w:p>
+            <w:pPr>
+              <w:spacing w:before="0" w:after="0" w:line="252" w:lineRule="auto"/>
+            </w:pPr>
+            <w:r>
+              <w:rPr>
+                <w:rFonts w:ascii="Calibri" w:hAnsi="Calibri"/>
+                <w:b w:val="0"/>
+                <w:color w:val="586674"/>
+                <w:sz w:val="16"/>
+              </w:rPr>
+              <w:t>[Date]</w:t>
             </w:r>
           </w:p>
         </w:tc>
@@ -756,76 +282,105 @@
       <w:tr>
         <w:tc>
           <w:tcPr>
-            <w:tcW w:type="dxa" w:w="2448"/>
+            <w:tcW w:type="dxa" w:w="2088"/>
             <w:tcBorders>
               <w:top w:val="single" w:sz="4" w:space="0" w:color="D9DEE5"/>
               <w:left w:val="single" w:sz="4" w:space="0" w:color="D9DEE5"/>
               <w:bottom w:val="single" w:sz="4" w:space="0" w:color="D9DEE5"/>
               <w:right w:val="single" w:sz="4" w:space="0" w:color="D9DEE5"/>
             </w:tcBorders>
+            <w:vAlign w:val="center"/>
           </w:tcPr>
           <w:p>
             <w:pPr>
-              <w:spacing w:after="0"/>
+              <w:spacing w:before="0" w:after="0" w:line="252" w:lineRule="auto"/>
             </w:pPr>
             <w:r>
               <w:rPr>
                 <w:rFonts w:ascii="Calibri" w:hAnsi="Calibri"/>
                 <w:b/>
                 <w:color w:val="0B2D45"/>
-                <w:sz w:val="19"/>
+                <w:sz w:val="16"/>
               </w:rPr>
-              <w:t>Figure title</w:t>
+              <w:t>Volume / Issue</w:t>
             </w:r>
           </w:p>
         </w:tc>
         <w:tc>
           <w:tcPr>
-            <w:tcW w:type="dxa" w:w="3456"/>
+            <w:tcW w:type="dxa" w:w="2232"/>
             <w:tcBorders>
               <w:top w:val="single" w:sz="4" w:space="0" w:color="D9DEE5"/>
               <w:left w:val="single" w:sz="4" w:space="0" w:color="D9DEE5"/>
               <w:bottom w:val="single" w:sz="4" w:space="0" w:color="D9DEE5"/>
               <w:right w:val="single" w:sz="4" w:space="0" w:color="D9DEE5"/>
             </w:tcBorders>
+            <w:vAlign w:val="center"/>
           </w:tcPr>
           <w:p>
             <w:pPr>
-              <w:spacing w:after="0"/>
+              <w:spacing w:before="0" w:after="0" w:line="252" w:lineRule="auto"/>
             </w:pPr>
             <w:r>
               <w:rPr>
                 <w:rFonts w:ascii="Calibri" w:hAnsi="Calibri"/>
                 <w:b w:val="0"/>
                 <w:color w:val="586674"/>
-                <w:sz w:val="19"/>
+                <w:sz w:val="16"/>
               </w:rPr>
-              <w:t>Above the figure, with explanatory caption as needed.</w:t>
+              <w:t>Pages</w:t>
             </w:r>
           </w:p>
         </w:tc>
         <w:tc>
           <w:tcPr>
-            <w:tcW w:type="dxa" w:w="3456"/>
+            <w:tcW w:type="dxa" w:w="2232"/>
             <w:tcBorders>
               <w:top w:val="single" w:sz="4" w:space="0" w:color="D9DEE5"/>
               <w:left w:val="single" w:sz="4" w:space="0" w:color="D9DEE5"/>
               <w:bottom w:val="single" w:sz="4" w:space="0" w:color="D9DEE5"/>
               <w:right w:val="single" w:sz="4" w:space="0" w:color="D9DEE5"/>
             </w:tcBorders>
+            <w:vAlign w:val="center"/>
           </w:tcPr>
           <w:p>
             <w:pPr>
-              <w:spacing w:after="0"/>
+              <w:spacing w:before="0" w:after="0" w:line="252" w:lineRule="auto"/>
             </w:pPr>
             <w:r>
               <w:rPr>
                 <w:rFonts w:ascii="Calibri" w:hAnsi="Calibri"/>
                 <w:b w:val="0"/>
                 <w:color w:val="586674"/>
-                <w:sz w:val="19"/>
+                <w:sz w:val="16"/>
               </w:rPr>
-              <w:t>[Insert note]</w:t>
+              <w:t>DOI</w:t>
+            </w:r>
+          </w:p>
+        </w:tc>
+        <w:tc>
+          <w:tcPr>
+            <w:tcW w:type="dxa" w:w="2808"/>
+            <w:tcBorders>
+              <w:top w:val="single" w:sz="4" w:space="0" w:color="D9DEE5"/>
+              <w:left w:val="single" w:sz="4" w:space="0" w:color="D9DEE5"/>
+              <w:bottom w:val="single" w:sz="4" w:space="0" w:color="D9DEE5"/>
+              <w:right w:val="single" w:sz="4" w:space="0" w:color="D9DEE5"/>
+            </w:tcBorders>
+            <w:vAlign w:val="center"/>
+          </w:tcPr>
+          <w:p>
+            <w:pPr>
+              <w:spacing w:before="0" w:after="0" w:line="252" w:lineRule="auto"/>
+            </w:pPr>
+            <w:r>
+              <w:rPr>
+                <w:rFonts w:ascii="Calibri" w:hAnsi="Calibri"/>
+                <w:b w:val="0"/>
+                <w:color w:val="586674"/>
+                <w:sz w:val="16"/>
+              </w:rPr>
+              <w:t>License</w:t>
             </w:r>
           </w:p>
         </w:tc>
@@ -833,76 +388,105 @@
       <w:tr>
         <w:tc>
           <w:tcPr>
-            <w:tcW w:type="dxa" w:w="2448"/>
+            <w:tcW w:type="dxa" w:w="2088"/>
             <w:tcBorders>
               <w:top w:val="single" w:sz="4" w:space="0" w:color="D9DEE5"/>
               <w:left w:val="single" w:sz="4" w:space="0" w:color="D9DEE5"/>
               <w:bottom w:val="single" w:sz="4" w:space="0" w:color="D9DEE5"/>
               <w:right w:val="single" w:sz="4" w:space="0" w:color="D9DEE5"/>
             </w:tcBorders>
+            <w:vAlign w:val="center"/>
           </w:tcPr>
           <w:p>
             <w:pPr>
-              <w:spacing w:after="0"/>
+              <w:spacing w:before="0" w:after="0" w:line="252" w:lineRule="auto"/>
             </w:pPr>
             <w:r>
               <w:rPr>
                 <w:rFonts w:ascii="Calibri" w:hAnsi="Calibri"/>
                 <w:b/>
                 <w:color w:val="0B2D45"/>
-                <w:sz w:val="19"/>
+                <w:sz w:val="16"/>
               </w:rPr>
-              <w:t>Notes</w:t>
+              <w:t>[Vol. x, No. x]</w:t>
             </w:r>
           </w:p>
         </w:tc>
         <w:tc>
           <w:tcPr>
-            <w:tcW w:type="dxa" w:w="3456"/>
+            <w:tcW w:type="dxa" w:w="2232"/>
             <w:tcBorders>
               <w:top w:val="single" w:sz="4" w:space="0" w:color="D9DEE5"/>
               <w:left w:val="single" w:sz="4" w:space="0" w:color="D9DEE5"/>
               <w:bottom w:val="single" w:sz="4" w:space="0" w:color="D9DEE5"/>
               <w:right w:val="single" w:sz="4" w:space="0" w:color="D9DEE5"/>
             </w:tcBorders>
+            <w:vAlign w:val="center"/>
           </w:tcPr>
           <w:p>
             <w:pPr>
-              <w:spacing w:after="0"/>
+              <w:spacing w:before="0" w:after="0" w:line="252" w:lineRule="auto"/>
             </w:pPr>
             <w:r>
               <w:rPr>
                 <w:rFonts w:ascii="Calibri" w:hAnsi="Calibri"/>
                 <w:b w:val="0"/>
                 <w:color w:val="586674"/>
-                <w:sz w:val="19"/>
+                <w:sz w:val="16"/>
               </w:rPr>
-              <w:t>Below the table/figure when needed.</w:t>
+              <w:t>[xx-xx]</w:t>
             </w:r>
           </w:p>
         </w:tc>
         <w:tc>
           <w:tcPr>
-            <w:tcW w:type="dxa" w:w="3456"/>
+            <w:tcW w:type="dxa" w:w="2232"/>
             <w:tcBorders>
               <w:top w:val="single" w:sz="4" w:space="0" w:color="D9DEE5"/>
               <w:left w:val="single" w:sz="4" w:space="0" w:color="D9DEE5"/>
               <w:bottom w:val="single" w:sz="4" w:space="0" w:color="D9DEE5"/>
               <w:right w:val="single" w:sz="4" w:space="0" w:color="D9DEE5"/>
             </w:tcBorders>
+            <w:vAlign w:val="center"/>
           </w:tcPr>
           <w:p>
             <w:pPr>
-              <w:spacing w:after="0"/>
+              <w:spacing w:before="0" w:after="0" w:line="252" w:lineRule="auto"/>
             </w:pPr>
             <w:r>
               <w:rPr>
                 <w:rFonts w:ascii="Calibri" w:hAnsi="Calibri"/>
                 <w:b w:val="0"/>
                 <w:color w:val="586674"/>
-                <w:sz w:val="19"/>
+                <w:sz w:val="16"/>
               </w:rPr>
-              <w:t>[Insert note]</w:t>
+              <w:t>[DOI]</w:t>
+            </w:r>
+          </w:p>
+        </w:tc>
+        <w:tc>
+          <w:tcPr>
+            <w:tcW w:type="dxa" w:w="2808"/>
+            <w:tcBorders>
+              <w:top w:val="single" w:sz="4" w:space="0" w:color="D9DEE5"/>
+              <w:left w:val="single" w:sz="4" w:space="0" w:color="D9DEE5"/>
+              <w:bottom w:val="single" w:sz="4" w:space="0" w:color="D9DEE5"/>
+              <w:right w:val="single" w:sz="4" w:space="0" w:color="D9DEE5"/>
+            </w:tcBorders>
+            <w:vAlign w:val="center"/>
+          </w:tcPr>
+          <w:p>
+            <w:pPr>
+              <w:spacing w:before="0" w:after="0" w:line="252" w:lineRule="auto"/>
+            </w:pPr>
+            <w:r>
+              <w:rPr>
+                <w:rFonts w:ascii="Calibri" w:hAnsi="Calibri"/>
+                <w:b w:val="0"/>
+                <w:color w:val="586674"/>
+                <w:sz w:val="16"/>
+              </w:rPr>
+              <w:t>[License, if assigned]</w:t>
             </w:r>
           </w:p>
         </w:tc>
@@ -910,14 +494,239 @@
     </w:tbl>
     <w:p>
       <w:pPr>
-        <w:spacing w:before="280" w:after="120"/>
+        <w:spacing w:before="240" w:after="80"/>
       </w:pPr>
       <w:r>
         <w:rPr>
           <w:rFonts w:ascii="Times New Roman" w:hAnsi="Times New Roman"/>
           <w:b/>
           <w:color w:val="0B2D45"/>
-          <w:sz w:val="28"/>
+          <w:sz w:val="25"/>
+        </w:rPr>
+        <w:t>Abstract</w:t>
+      </w:r>
+    </w:p>
+    <w:p>
+      <w:pPr>
+        <w:spacing w:before="0" w:after="100" w:line="276" w:lineRule="auto"/>
+      </w:pPr>
+      <w:r>
+        <w:rPr>
+          <w:rFonts w:ascii="Times New Roman" w:hAnsi="Times New Roman"/>
+          <w:b w:val="0"/>
+          <w:i w:val="0"/>
+          <w:sz w:val="21"/>
+        </w:rPr>
+        <w:t>[Insert abstract text here. The abstract should briefly present the purpose, method, findings, and contribution of the article.]</w:t>
+      </w:r>
+    </w:p>
+    <w:p>
+      <w:pPr>
+        <w:spacing w:before="240" w:after="80"/>
+      </w:pPr>
+      <w:r>
+        <w:rPr>
+          <w:rFonts w:ascii="Times New Roman" w:hAnsi="Times New Roman"/>
+          <w:b/>
+          <w:color w:val="0B2D45"/>
+          <w:sz w:val="25"/>
+        </w:rPr>
+        <w:t>Keywords</w:t>
+      </w:r>
+    </w:p>
+    <w:p>
+      <w:pPr>
+        <w:spacing w:before="0" w:after="100" w:line="276" w:lineRule="auto"/>
+      </w:pPr>
+      <w:r>
+        <w:rPr>
+          <w:rFonts w:ascii="Times New Roman" w:hAnsi="Times New Roman"/>
+          <w:b w:val="0"/>
+          <w:i/>
+          <w:color w:val="586674"/>
+          <w:sz w:val="21"/>
+        </w:rPr>
+        <w:t>[keyword 1]; [keyword 2]; [keyword 3]; [keyword 4]; [keyword 5]</w:t>
+      </w:r>
+    </w:p>
+    <w:p>
+      <w:pPr>
+        <w:spacing w:before="240" w:after="80"/>
+      </w:pPr>
+      <w:r>
+        <w:rPr>
+          <w:rFonts w:ascii="Times New Roman" w:hAnsi="Times New Roman"/>
+          <w:b/>
+          <w:color w:val="0B2D45"/>
+          <w:sz w:val="25"/>
+        </w:rPr>
+        <w:t>1. Introduction</w:t>
+      </w:r>
+    </w:p>
+    <w:p>
+      <w:pPr>
+        <w:spacing w:before="0" w:after="100" w:line="324" w:lineRule="auto"/>
+      </w:pPr>
+      <w:r>
+        <w:rPr>
+          <w:rFonts w:ascii="Times New Roman" w:hAnsi="Times New Roman"/>
+          <w:b w:val="0"/>
+          <w:i w:val="0"/>
+          <w:sz w:val="22"/>
+        </w:rPr>
+        <w:t>[Introduce the research problem, context, research gap, purpose, and research questions.]</w:t>
+      </w:r>
+    </w:p>
+    <w:p>
+      <w:pPr>
+        <w:spacing w:before="240" w:after="80"/>
+      </w:pPr>
+      <w:r>
+        <w:rPr>
+          <w:rFonts w:ascii="Times New Roman" w:hAnsi="Times New Roman"/>
+          <w:b/>
+          <w:color w:val="0B2D45"/>
+          <w:sz w:val="25"/>
+        </w:rPr>
+        <w:t>2. Literature Review / Theoretical Framework</w:t>
+      </w:r>
+    </w:p>
+    <w:p>
+      <w:pPr>
+        <w:spacing w:before="0" w:after="100" w:line="324" w:lineRule="auto"/>
+      </w:pPr>
+      <w:r>
+        <w:rPr>
+          <w:rFonts w:ascii="Times New Roman" w:hAnsi="Times New Roman"/>
+          <w:b w:val="0"/>
+          <w:i w:val="0"/>
+          <w:sz w:val="22"/>
+        </w:rPr>
+        <w:t>[Present the relevant literature, conceptual background, and theoretical framing.]</w:t>
+      </w:r>
+    </w:p>
+    <w:p>
+      <w:pPr>
+        <w:spacing w:before="240" w:after="80"/>
+      </w:pPr>
+      <w:r>
+        <w:rPr>
+          <w:rFonts w:ascii="Times New Roman" w:hAnsi="Times New Roman"/>
+          <w:b/>
+          <w:color w:val="0B2D45"/>
+          <w:sz w:val="25"/>
+        </w:rPr>
+        <w:t>3. Method</w:t>
+      </w:r>
+    </w:p>
+    <w:p>
+      <w:pPr>
+        <w:spacing w:before="0" w:after="100" w:line="324" w:lineRule="auto"/>
+      </w:pPr>
+      <w:r>
+        <w:rPr>
+          <w:rFonts w:ascii="Times New Roman" w:hAnsi="Times New Roman"/>
+          <w:b w:val="0"/>
+          <w:i w:val="0"/>
+          <w:sz w:val="22"/>
+        </w:rPr>
+        <w:t>[Describe design, context, participants, data collection, analysis, validity/trustworthiness, and ethics.]</w:t>
+      </w:r>
+    </w:p>
+    <w:p>
+      <w:pPr>
+        <w:spacing w:before="240" w:after="80"/>
+      </w:pPr>
+      <w:r>
+        <w:rPr>
+          <w:rFonts w:ascii="Times New Roman" w:hAnsi="Times New Roman"/>
+          <w:b/>
+          <w:color w:val="0B2D45"/>
+          <w:sz w:val="25"/>
+        </w:rPr>
+        <w:t>4. Findings</w:t>
+      </w:r>
+    </w:p>
+    <w:p>
+      <w:pPr>
+        <w:spacing w:before="0" w:after="100" w:line="324" w:lineRule="auto"/>
+      </w:pPr>
+      <w:r>
+        <w:rPr>
+          <w:rFonts w:ascii="Times New Roman" w:hAnsi="Times New Roman"/>
+          <w:b w:val="0"/>
+          <w:i w:val="0"/>
+          <w:sz w:val="22"/>
+        </w:rPr>
+        <w:t>[Present findings clearly, using tables and figures only where they improve readability.]</w:t>
+      </w:r>
+    </w:p>
+    <w:p>
+      <w:pPr>
+        <w:spacing w:before="240" w:after="80"/>
+      </w:pPr>
+      <w:r>
+        <w:rPr>
+          <w:rFonts w:ascii="Times New Roman" w:hAnsi="Times New Roman"/>
+          <w:b/>
+          <w:color w:val="0B2D45"/>
+          <w:sz w:val="25"/>
+        </w:rPr>
+        <w:t>5. Discussion</w:t>
+      </w:r>
+    </w:p>
+    <w:p>
+      <w:pPr>
+        <w:spacing w:before="0" w:after="100" w:line="324" w:lineRule="auto"/>
+      </w:pPr>
+      <w:r>
+        <w:rPr>
+          <w:rFonts w:ascii="Times New Roman" w:hAnsi="Times New Roman"/>
+          <w:b w:val="0"/>
+          <w:i w:val="0"/>
+          <w:sz w:val="22"/>
+        </w:rPr>
+        <w:t>[Interpret the findings in relation to the literature and explain their implications.]</w:t>
+      </w:r>
+    </w:p>
+    <w:p>
+      <w:pPr>
+        <w:spacing w:before="240" w:after="80"/>
+      </w:pPr>
+      <w:r>
+        <w:rPr>
+          <w:rFonts w:ascii="Times New Roman" w:hAnsi="Times New Roman"/>
+          <w:b/>
+          <w:color w:val="0B2D45"/>
+          <w:sz w:val="25"/>
+        </w:rPr>
+        <w:t>6. Conclusion</w:t>
+      </w:r>
+    </w:p>
+    <w:p>
+      <w:pPr>
+        <w:spacing w:before="0" w:after="100" w:line="324" w:lineRule="auto"/>
+      </w:pPr>
+      <w:r>
+        <w:rPr>
+          <w:rFonts w:ascii="Times New Roman" w:hAnsi="Times New Roman"/>
+          <w:b w:val="0"/>
+          <w:i w:val="0"/>
+          <w:sz w:val="22"/>
+        </w:rPr>
+        <w:t>[Summarize the contribution, limitations, and suggestions for future research.]</w:t>
+      </w:r>
+    </w:p>
+    <w:p>
+      <w:pPr>
+        <w:spacing w:before="240" w:after="80"/>
+      </w:pPr>
+      <w:r>
+        <w:rPr>
+          <w:rFonts w:ascii="Times New Roman" w:hAnsi="Times New Roman"/>
+          <w:b/>
+          <w:color w:val="0B2D45"/>
+          <w:sz w:val="25"/>
         </w:rPr>
         <w:t>Declarations</w:t>
       </w:r>
@@ -925,64 +734,25 @@
     <w:p>
       <w:pPr>
         <w:pStyle w:val="ListBullet"/>
-        <w:spacing w:after="60"/>
+        <w:spacing w:after="40" w:line="264" w:lineRule="auto"/>
       </w:pPr>
       <w:r>
         <w:rPr>
           <w:rFonts w:ascii="Times New Roman" w:hAnsi="Times New Roman"/>
-          <w:sz w:val="22"/>
+          <w:sz w:val="21"/>
         </w:rPr>
-        <w:t>Ethics approval and consent to participate: [Insert statement]</w:t>
+        <w:t>Ethics approval and informed consent: [Insert statement]</w:t>
       </w:r>
     </w:p>
     <w:p>
       <w:pPr>
         <w:pStyle w:val="ListBullet"/>
-        <w:spacing w:after="60"/>
+        <w:spacing w:after="40" w:line="264" w:lineRule="auto"/>
       </w:pPr>
       <w:r>
         <w:rPr>
           <w:rFonts w:ascii="Times New Roman" w:hAnsi="Times New Roman"/>
-          <w:sz w:val="22"/>
-        </w:rPr>
-        <w:t>Consent for publication: [Insert statement]</w:t>
-      </w:r>
-    </w:p>
-    <w:p>
-      <w:pPr>
-        <w:pStyle w:val="ListBullet"/>
-        <w:spacing w:after="60"/>
-      </w:pPr>
-      <w:r>
-        <w:rPr>
-          <w:rFonts w:ascii="Times New Roman" w:hAnsi="Times New Roman"/>
-          <w:sz w:val="22"/>
-        </w:rPr>
-        <w:t>Availability of data and materials: [Insert statement]</w:t>
-      </w:r>
-    </w:p>
-    <w:p>
-      <w:pPr>
-        <w:pStyle w:val="ListBullet"/>
-        <w:spacing w:after="60"/>
-      </w:pPr>
-      <w:r>
-        <w:rPr>
-          <w:rFonts w:ascii="Times New Roman" w:hAnsi="Times New Roman"/>
-          <w:sz w:val="22"/>
-        </w:rPr>
-        <w:t>Competing interests: [Insert statement]</w:t>
-      </w:r>
-    </w:p>
-    <w:p>
-      <w:pPr>
-        <w:pStyle w:val="ListBullet"/>
-        <w:spacing w:after="60"/>
-      </w:pPr>
-      <w:r>
-        <w:rPr>
-          <w:rFonts w:ascii="Times New Roman" w:hAnsi="Times New Roman"/>
-          <w:sz w:val="22"/>
+          <w:sz w:val="21"/>
         </w:rPr>
         <w:t>Funding: [Insert statement]</w:t>
       </w:r>
@@ -990,59 +760,88 @@
     <w:p>
       <w:pPr>
         <w:pStyle w:val="ListBullet"/>
-        <w:spacing w:after="60"/>
+        <w:spacing w:after="40" w:line="264" w:lineRule="auto"/>
       </w:pPr>
       <w:r>
         <w:rPr>
           <w:rFonts w:ascii="Times New Roman" w:hAnsi="Times New Roman"/>
-          <w:sz w:val="22"/>
+          <w:sz w:val="21"/>
         </w:rPr>
-        <w:t>Authors contributions: [Insert statement]</w:t>
+        <w:t>Conflict of interest: [Insert statement]</w:t>
       </w:r>
     </w:p>
     <w:p>
       <w:pPr>
         <w:pStyle w:val="ListBullet"/>
-        <w:spacing w:after="60"/>
+        <w:spacing w:after="40" w:line="264" w:lineRule="auto"/>
       </w:pPr>
       <w:r>
         <w:rPr>
           <w:rFonts w:ascii="Times New Roman" w:hAnsi="Times New Roman"/>
-          <w:sz w:val="22"/>
+          <w:sz w:val="21"/>
         </w:rPr>
-        <w:t>Acknowledgements: [Insert statement]</w:t>
+        <w:t>Data availability: [Insert statement]</w:t>
       </w:r>
     </w:p>
     <w:p>
       <w:pPr>
         <w:pStyle w:val="ListBullet"/>
-        <w:spacing w:after="60"/>
+        <w:spacing w:after="40" w:line="264" w:lineRule="auto"/>
       </w:pPr>
       <w:r>
         <w:rPr>
           <w:rFonts w:ascii="Times New Roman" w:hAnsi="Times New Roman"/>
-          <w:sz w:val="22"/>
+          <w:sz w:val="21"/>
         </w:rPr>
-        <w:t>Use of artificial intelligence tools, if applicable: [Insert statement]</w:t>
+        <w:t>Use of AI tools, if applicable: [Insert statement]</w:t>
       </w:r>
     </w:p>
     <w:p>
       <w:pPr>
-        <w:spacing w:before="280" w:after="120"/>
+        <w:spacing w:before="240" w:after="80"/>
       </w:pPr>
       <w:r>
         <w:rPr>
           <w:rFonts w:ascii="Times New Roman" w:hAnsi="Times New Roman"/>
           <w:b/>
           <w:color w:val="0B2D45"/>
-          <w:sz w:val="28"/>
+          <w:sz w:val="25"/>
         </w:rPr>
         <w:t>References</w:t>
       </w:r>
     </w:p>
     <w:p>
       <w:pPr>
-        <w:spacing w:before="0" w:after="160" w:line="264" w:lineRule="auto"/>
+        <w:spacing w:before="0" w:after="100" w:line="276" w:lineRule="auto"/>
+        <w:ind w:left="504" w:hanging="504"/>
+      </w:pPr>
+      <w:r>
+        <w:rPr>
+          <w:rFonts w:ascii="Times New Roman" w:hAnsi="Times New Roman"/>
+          <w:b w:val="0"/>
+          <w:i w:val="0"/>
+          <w:sz w:val="21"/>
+        </w:rPr>
+        <w:t>Surname, A. A., &amp; Surname, B. B. (Year). Title of the article. Journal Title, volume(issue), page-page. https://doi.org/xxxxx</w:t>
+      </w:r>
+    </w:p>
+    <w:p>
+      <w:pPr>
+        <w:spacing w:before="240" w:after="80"/>
+      </w:pPr>
+      <w:r>
+        <w:rPr>
+          <w:rFonts w:ascii="Times New Roman" w:hAnsi="Times New Roman"/>
+          <w:b/>
+          <w:color w:val="0B2D45"/>
+          <w:sz w:val="25"/>
+        </w:rPr>
+        <w:t>Author Note</w:t>
+      </w:r>
+    </w:p>
+    <w:p>
+      <w:pPr>
+        <w:spacing w:before="0" w:after="100" w:line="276" w:lineRule="auto"/>
       </w:pPr>
       <w:r>
         <w:rPr>
@@ -1050,136 +849,16 @@
           <w:b w:val="0"/>
           <w:i/>
           <w:color w:val="586674"/>
-          <w:sz w:val="20"/>
+          <w:sz w:val="21"/>
         </w:rPr>
-        <w:t>List references according to APA 7. Check every in-text citation against the reference list.</w:t>
-      </w:r>
-    </w:p>
-    <w:p>
-      <w:pPr>
-        <w:spacing w:before="0" w:after="120" w:line="276" w:lineRule="auto"/>
-        <w:ind w:hanging="504" w:left="504"/>
-      </w:pPr>
-      <w:r>
-        <w:rPr>
-          <w:rFonts w:ascii="Times New Roman" w:hAnsi="Times New Roman"/>
-          <w:b w:val="0"/>
-          <w:i w:val="0"/>
-          <w:sz w:val="24"/>
-        </w:rPr>
-        <w:t>Surname, A. A., &amp; Surname, B. B. (Year). Title of the article. Journal Title, volume(issue), page-page. https://doi.org/xxxxx</w:t>
-      </w:r>
-    </w:p>
-    <w:p>
-      <w:pPr>
-        <w:spacing w:before="280" w:after="120"/>
-      </w:pPr>
-      <w:r>
-        <w:rPr>
-          <w:rFonts w:ascii="Times New Roman" w:hAnsi="Times New Roman"/>
-          <w:b/>
-          <w:color w:val="0B2D45"/>
-          <w:sz w:val="28"/>
-        </w:rPr>
-        <w:t>Pre-submission Checklist</w:t>
-      </w:r>
-    </w:p>
-    <w:p>
-      <w:pPr>
-        <w:pStyle w:val="ListBullet"/>
-        <w:spacing w:after="60"/>
-      </w:pPr>
-      <w:r>
-        <w:rPr>
-          <w:rFonts w:ascii="Times New Roman" w:hAnsi="Times New Roman"/>
-          <w:sz w:val="22"/>
-        </w:rPr>
-        <w:t>The manuscript is written in English.</w:t>
-      </w:r>
-    </w:p>
-    <w:p>
-      <w:pPr>
-        <w:pStyle w:val="ListBullet"/>
-        <w:spacing w:after="60"/>
-      </w:pPr>
-      <w:r>
-        <w:rPr>
-          <w:rFonts w:ascii="Times New Roman" w:hAnsi="Times New Roman"/>
-          <w:sz w:val="22"/>
-        </w:rPr>
-        <w:t>APA 7 style has been followed.</w:t>
-      </w:r>
-    </w:p>
-    <w:p>
-      <w:pPr>
-        <w:pStyle w:val="ListBullet"/>
-        <w:spacing w:after="60"/>
-      </w:pPr>
-      <w:r>
-        <w:rPr>
-          <w:rFonts w:ascii="Times New Roman" w:hAnsi="Times New Roman"/>
-          <w:sz w:val="22"/>
-        </w:rPr>
-        <w:t>The manuscript has been anonymized for review, if required.</w:t>
-      </w:r>
-    </w:p>
-    <w:p>
-      <w:pPr>
-        <w:pStyle w:val="ListBullet"/>
-        <w:spacing w:after="60"/>
-      </w:pPr>
-      <w:r>
-        <w:rPr>
-          <w:rFonts w:ascii="Times New Roman" w:hAnsi="Times New Roman"/>
-          <w:sz w:val="22"/>
-        </w:rPr>
-        <w:t>The title page is prepared as a separate file.</w:t>
-      </w:r>
-    </w:p>
-    <w:p>
-      <w:pPr>
-        <w:pStyle w:val="ListBullet"/>
-        <w:spacing w:after="60"/>
-      </w:pPr>
-      <w:r>
-        <w:rPr>
-          <w:rFonts w:ascii="Times New Roman" w:hAnsi="Times New Roman"/>
-          <w:sz w:val="22"/>
-        </w:rPr>
-        <w:t>Ethics approval and informed consent are reported where applicable.</w:t>
-      </w:r>
-    </w:p>
-    <w:p>
-      <w:pPr>
-        <w:pStyle w:val="ListBullet"/>
-        <w:spacing w:after="60"/>
-      </w:pPr>
-      <w:r>
-        <w:rPr>
-          <w:rFonts w:ascii="Times New Roman" w:hAnsi="Times New Roman"/>
-          <w:sz w:val="22"/>
-        </w:rPr>
-        <w:t>Funding, conflicts of interest, and AI use are disclosed.</w:t>
-      </w:r>
-    </w:p>
-    <w:p>
-      <w:pPr>
-        <w:pStyle w:val="ListBullet"/>
-        <w:spacing w:after="60"/>
-      </w:pPr>
-      <w:r>
-        <w:rPr>
-          <w:rFonts w:ascii="Times New Roman" w:hAnsi="Times New Roman"/>
-          <w:sz w:val="22"/>
-        </w:rPr>
-        <w:t>All tables, figures, appendices, and supplementary files are complete.</w:t>
+        <w:t>[Optional author note, acknowledgements, or correspondence information.]</w:t>
       </w:r>
     </w:p>
     <w:sectPr>
       <w:headerReference w:type="default" r:id="rId9"/>
       <w:footerReference w:type="default" r:id="rId10"/>
       <w:pgSz w:w="12240" w:h="15840"/>
-      <w:pgMar w:top="1440" w:right="1440" w:bottom="1440" w:left="1440" w:header="648" w:footer="648" w:gutter="0"/>
+      <w:pgMar w:top="1224" w:right="1440" w:bottom="1224" w:left="1440" w:header="504" w:footer="504" w:gutter="0"/>
       <w:cols w:space="720"/>
       <w:docGrid w:linePitch="360"/>
     </w:sectPr>
@@ -1198,9 +877,9 @@
       <w:rPr>
         <w:rFonts w:ascii="Calibri" w:hAnsi="Calibri"/>
         <w:color w:val="586674"/>
-        <w:sz w:val="17"/>
-      </w:rPr>
-      <w:t>IJLES manuscript template - Please remove instructional notes before submission.</w:t>
+        <w:sz w:val="15"/>
+      </w:rPr>
+      <w:t>IJLES | www.ijles.org | ijlescontact@gmail.com</w:t>
     </w:r>
   </w:p>
 </w:ftr>
@@ -1217,11 +896,12 @@
     <w:tblPr>
       <w:tblW w:type="auto" w:w="0"/>
       <w:jc w:val="center"/>
+      <w:tblLayout w:type="fixed"/>
       <w:tblLook w:firstColumn="1" w:firstRow="1" w:lastColumn="0" w:lastRow="0" w:noHBand="0" w:noVBand="1" w:val="04A0"/>
     </w:tblPr>
     <w:tblGrid>
-      <w:gridCol w:w="1152"/>
-      <w:gridCol w:w="8208"/>
+      <w:gridCol w:w="792"/>
+      <w:gridCol w:w="8568"/>
     </w:tblGrid>
     <w:tr>
       <w:tc>
@@ -1231,12 +911,12 @@
         </w:tcPr>
         <w:p>
           <w:pPr>
-            <w:spacing w:after="0"/>
+            <w:spacing w:after="0" w:line="240" w:lineRule="auto"/>
           </w:pPr>
           <w:r>
             <w:drawing>
               <wp:inline xmlns:a="http://schemas.openxmlformats.org/drawingml/2006/main" xmlns:pic="http://schemas.openxmlformats.org/drawingml/2006/picture">
-                <wp:extent cx="502920" cy="502920"/>
+                <wp:extent cx="384048" cy="384048"/>
                 <wp:docPr id="1" name="Picture 1"/>
                 <wp:cNvGraphicFramePr>
                   <a:graphicFrameLocks noChangeAspect="1"/>
@@ -1257,7 +937,7 @@
                       <pic:spPr>
                         <a:xfrm>
                           <a:off x="0" y="0"/>
-                          <a:ext cx="502920" cy="502920"/>
+                          <a:ext cx="384048" cy="384048"/>
                         </a:xfrm>
                         <a:prstGeom prst="rect"/>
                       </pic:spPr>
@@ -1276,14 +956,14 @@
         </w:tcPr>
         <w:p>
           <w:pPr>
-            <w:spacing w:after="0"/>
+            <w:spacing w:after="0" w:line="240" w:lineRule="auto"/>
           </w:pPr>
           <w:r>
             <w:rPr>
               <w:rFonts w:ascii="Georgia" w:hAnsi="Georgia"/>
               <w:b/>
               <w:color w:val="0B2D45"/>
-              <w:sz w:val="22"/>
+              <w:sz w:val="17"/>
             </w:rPr>
             <w:t>International Journal of Language, Education and Society (IJLES)</w:t>
           </w:r>
@@ -1294,9 +974,9 @@
             <w:rPr>
               <w:rFonts w:ascii="Calibri" w:hAnsi="Calibri"/>
               <w:color w:val="586674"/>
-              <w:sz w:val="17"/>
+              <w:sz w:val="14"/>
             </w:rPr>
-            <w:t>Manuscript Template | www.ijles.org | ijlescontact@gmail.com</w:t>
+            <w:t>Year: [Year] | Volume: [Vol.] | Issue: [No.] | Pages: [xx-xx] | DOI: [doi]</w:t>
           </w:r>
         </w:p>
       </w:tc>
@@ -1669,11 +1349,11 @@
     <w:qFormat/>
     <w:rsid w:val="00FC693F"/>
     <w:pPr>
-      <w:spacing w:after="120" w:line="276" w:lineRule="auto"/>
+      <w:spacing w:after="100" w:line="276" w:lineRule="auto"/>
     </w:pPr>
     <w:rPr>
       <w:rFonts w:ascii="Times New Roman" w:hAnsi="Times New Roman"/>
-      <w:sz w:val="24"/>
+      <w:sz w:val="22"/>
     </w:rPr>
   </w:style>
   <w:style w:type="paragraph" w:styleId="Header">

</xml_diff>